<commit_message>
docs: update API docs to v1.1 for SDK v2.1.0
- Version header updated: 1.0 → 1.1, SDK v2.0.0 → v2.1.0
- scale-sdk-v2.js module description includes Fetch Interceptor
- DNI section: phone now from visit response, fallback call documented
- DNI timing section: updated to reflect faster post-LCP behavior
- New section 3.3 Fetch Interceptor: auto-enrichment for /api/leads
  and /api/contacts/public documented with field-by-field breakdown
- 3.3 Analytics renamed to 3.4
- /api/calls/phone/assign endpoint marked as fallback in section 7.2
- Footer updated to Version 1.1 — 2026
</commit_message>
<xml_diff>
--- a/docs/Scale-SDK-API-Docs-EN.docx
+++ b/docs/Scale-SDK-API-Docs-EN.docx
@@ -101,7 +101,7 @@
           <w:sz w:val="20"/>
           <w:szCs w:val="20"/>
         </w:rPr>
-        <w:t>Version 1.0  |  SDK v2.0.0  |  202</w:t>
+        <w:t>Version 1.1  |  SDK v2.1.0  |  202</w:t>
       </w:r>
       <w:r>
         <w:rPr>
@@ -160,11 +160,7 @@
         <w:p>
           <w:r>
             <w:fldChar w:fldCharType="begin"/>
-          </w:r>
-          <w:r>
             <w:instrText xml:space="preserve">TOC \h \o "1-3"</w:instrText>
-          </w:r>
-          <w:r>
             <w:fldChar w:fldCharType="separate"/>
           </w:r>
         </w:p>
@@ -578,7 +574,7 @@
                 <w:sz w:val="19"/>
                 <w:szCs w:val="19"/>
               </w:rPr>
-              <w:t>v2.0.0</w:t>
+              <w:t>v2.1.0</w:t>
             </w:r>
           </w:p>
         </w:tc>
@@ -616,7 +612,7 @@
                 <w:sz w:val="19"/>
                 <w:szCs w:val="19"/>
               </w:rPr>
-              <w:t>Core SDK: session management, server-side visit tracking, Dynamic Number Insertion (DNI), and TrustedForm certificate loading.</w:t>
+              <w:t>Core SDK: session management, server-side visit tracking, Dynamic Number Insertion (DNI), TrustedForm certificate loading, and Fetch Interceptor for automatic API enrichment.</w:t>
             </w:r>
           </w:p>
         </w:tc>
@@ -3502,7 +3498,7 @@
           <w:sz w:val="22"/>
           <w:szCs w:val="22"/>
         </w:rPr>
-        <w:t>The DNI module fetches a phone number from the server based on the session, UTM campaign, and business hours, then automatically replaces it in matching DOM elements.</w:t>
+        <w:t>The DNI module resolves a phone number and automatically replaces it in matching DOM elements. As of v2.1.0, the phone number is delivered directly in the visit registration response (/api/visits). A separate call to /api/calls/phone/assign is made only as a fallback if the visit response does not include a phone.</w:t>
       </w:r>
     </w:p>
     <w:p>
@@ -3725,7 +3721,7 @@
           <w:sz w:val="22"/>
           <w:szCs w:val="22"/>
         </w:rPr>
-        <w:t>The phone number is requested from the server after the LCP (Largest Contentful Paint) event + 500ms delay. If LCP does not fire within 4 seconds, it executes anyway as a fallback. This prevents competing with critical page resources.</w:t>
+        <w:t>As of v2.1.0, the phone number is resolved from the visit registration response and displayed immediately, with no additional delay. If the visit response does not include a phone, the SDK triggers a fallback fetch after LCP. If LCP does not fire within 1.5 seconds, it executes anyway. This ensures the phone number appears as fast as possible without competing with critical page resources.</w:t>
       </w:r>
     </w:p>
     <w:p>
@@ -4940,7 +4936,391 @@
           <w:sz w:val="27"/>
           <w:szCs w:val="27"/>
         </w:rPr>
-        <w:t>3.3 Analytics — GTM (scale-analytics.js)</w:t>
+        <w:t>3.3 Fetch Interceptor (scale-sdk-v2.js)</w:t>
+      </w:r>
+    </w:p>
+    <w:p>
+      <w:pPr>
+        <w:spacing w:before="80" w:after="80"/>
+        <w:jc w:val="left"/>
+      </w:pPr>
+      <w:r>
+        <w:rPr>
+          <w:rFonts w:ascii="Arial" w:hAnsi="Arial" w:eastAsia="Arial" w:cs="Arial"/>
+          <w:b w:val="0"/>
+          <w:bCs w:val="0"/>
+          <w:i w:val="0"/>
+          <w:iCs w:val="0"/>
+          <w:color w:val="1A1A1A"/>
+          <w:sz w:val="22"/>
+          <w:szCs w:val="22"/>
+        </w:rPr>
+        <w:t xml:space="preserve">New in v2.1.0. The SDK automatically patches </w:t>
+      </w:r>
+      <w:r>
+        <w:rPr>
+          <w:rFonts w:ascii="Courier New" w:hAnsi="Courier New" w:cs="Courier New"/>
+          <w:b w:val="0"/>
+          <w:color w:val="1B4F72"/>
+          <w:sz w:val="20"/>
+          <w:szCs w:val="20"/>
+        </w:rPr>
+        <w:t>window.fetch</w:t>
+      </w:r>
+      <w:r>
+        <w:rPr>
+          <w:rFonts w:ascii="Arial" w:hAnsi="Arial" w:eastAsia="Arial" w:cs="Arial"/>
+          <w:b w:val="0"/>
+          <w:bCs w:val="0"/>
+          <w:color w:val="1A1A1A"/>
+          <w:sz w:val="22"/>
+          <w:szCs w:val="22"/>
+        </w:rPr>
+        <w:t xml:space="preserve"> to automatically enrich outgoing API calls with session and tracking data. No manual changes are required in your form submission code.</w:t>
+      </w:r>
+    </w:p>
+    <w:p>
+      <w:pPr>
+        <w:spacing w:before="100" w:after="0"/>
+      </w:pPr>
+    </w:p>
+    <w:p>
+      <w:pPr>
+        <w:pStyle w:val="4"/>
+        <w:spacing w:before="180" w:after="70"/>
+      </w:pPr>
+      <w:r>
+        <w:rPr>
+          <w:rFonts w:ascii="Arial" w:hAnsi="Arial" w:eastAsia="Arial" w:cs="Arial"/>
+          <w:b/>
+          <w:bCs/>
+          <w:color w:val="2C3E50"/>
+          <w:sz w:val="23"/>
+          <w:szCs w:val="23"/>
+        </w:rPr>
+        <w:t>POST /api/leads — automatic enrichment</w:t>
+      </w:r>
+    </w:p>
+    <w:p>
+      <w:pPr>
+        <w:spacing w:before="80" w:after="80"/>
+        <w:jc w:val="left"/>
+      </w:pPr>
+      <w:r>
+        <w:rPr>
+          <w:rFonts w:ascii="Arial" w:hAnsi="Arial" w:eastAsia="Arial" w:cs="Arial"/>
+          <w:b w:val="0"/>
+          <w:bCs w:val="0"/>
+          <w:color w:val="1A1A1A"/>
+          <w:sz w:val="22"/>
+          <w:szCs w:val="22"/>
+        </w:rPr>
+        <w:t xml:space="preserve">Every </w:t>
+      </w:r>
+      <w:r>
+        <w:rPr>
+          <w:rFonts w:ascii="Courier New" w:hAnsi="Courier New" w:cs="Courier New"/>
+          <w:b w:val="0"/>
+          <w:color w:val="1B4F72"/>
+          <w:sz w:val="20"/>
+          <w:szCs w:val="20"/>
+        </w:rPr>
+        <w:t>POST /api/leads</w:t>
+      </w:r>
+      <w:r>
+        <w:rPr>
+          <w:rFonts w:ascii="Arial" w:hAnsi="Arial" w:eastAsia="Arial" w:cs="Arial"/>
+          <w:b w:val="0"/>
+          <w:bCs w:val="0"/>
+          <w:color w:val="1A1A1A"/>
+          <w:sz w:val="22"/>
+          <w:szCs w:val="22"/>
+        </w:rPr>
+        <w:t xml:space="preserve"> request is intercepted and the following fields are injected automatically if not already present in the body:</w:t>
+      </w:r>
+    </w:p>
+    <w:p>
+      <w:pPr>
+        <w:pStyle w:val="16"/>
+        <w:numPr>
+          <w:ilvl w:val="0"/>
+          <w:numId w:val="2"/>
+        </w:numPr>
+        <w:spacing w:before="40" w:after="40"/>
+      </w:pPr>
+      <w:r>
+        <w:rPr>
+          <w:rFonts w:ascii="Courier New" w:hAnsi="Courier New" w:cs="Courier New"/>
+          <w:b/>
+          <w:color w:val="1B4F72"/>
+          <w:sz w:val="20"/>
+          <w:szCs w:val="20"/>
+        </w:rPr>
+        <w:t>session_id</w:t>
+      </w:r>
+      <w:r>
+        <w:rPr>
+          <w:rFonts w:ascii="Arial" w:hAnsi="Arial" w:eastAsia="Arial" w:cs="Arial"/>
+          <w:b w:val="0"/>
+          <w:color w:val="1A1A1A"/>
+          <w:sz w:val="21"/>
+          <w:szCs w:val="21"/>
+        </w:rPr>
+        <w:t xml:space="preserve"> — current SDK session ID</w:t>
+      </w:r>
+    </w:p>
+    <w:p>
+      <w:pPr>
+        <w:pStyle w:val="16"/>
+        <w:numPr>
+          <w:ilvl w:val="0"/>
+          <w:numId w:val="2"/>
+        </w:numPr>
+        <w:spacing w:before="40" w:after="40"/>
+      </w:pPr>
+      <w:r>
+        <w:rPr>
+          <w:rFonts w:ascii="Courier New" w:hAnsi="Courier New" w:cs="Courier New"/>
+          <w:b/>
+          <w:color w:val="1B4F72"/>
+          <w:sz w:val="20"/>
+          <w:szCs w:val="20"/>
+        </w:rPr>
+        <w:t>visit_id</w:t>
+      </w:r>
+      <w:r>
+        <w:rPr>
+          <w:rFonts w:ascii="Arial" w:hAnsi="Arial" w:eastAsia="Arial" w:cs="Arial"/>
+          <w:b w:val="0"/>
+          <w:color w:val="1A1A1A"/>
+          <w:sz w:val="21"/>
+          <w:szCs w:val="21"/>
+        </w:rPr>
+        <w:t xml:space="preserve"> — visit ID from the server registration</w:t>
+      </w:r>
+    </w:p>
+    <w:p>
+      <w:pPr>
+        <w:pStyle w:val="16"/>
+        <w:numPr>
+          <w:ilvl w:val="0"/>
+          <w:numId w:val="2"/>
+        </w:numPr>
+        <w:spacing w:before="40" w:after="40"/>
+      </w:pPr>
+      <w:r>
+        <w:rPr>
+          <w:rFonts w:ascii="Courier New" w:hAnsi="Courier New" w:cs="Courier New"/>
+          <w:b/>
+          <w:color w:val="1B4F72"/>
+          <w:sz w:val="20"/>
+          <w:szCs w:val="20"/>
+        </w:rPr>
+        <w:t>funnel_step_id</w:t>
+      </w:r>
+      <w:r>
+        <w:rPr>
+          <w:rFonts w:ascii="Arial" w:hAnsi="Arial" w:eastAsia="Arial" w:cs="Arial"/>
+          <w:b w:val="0"/>
+          <w:color w:val="1A1A1A"/>
+          <w:sz w:val="21"/>
+          <w:szCs w:val="21"/>
+        </w:rPr>
+        <w:t xml:space="preserve"> — step ID from </w:t>
+      </w:r>
+      <w:r>
+        <w:rPr>
+          <w:rFonts w:ascii="Courier New" w:hAnsi="Courier New" w:cs="Courier New"/>
+          <w:b w:val="0"/>
+          <w:color w:val="1B4F72"/>
+          <w:sz w:val="20"/>
+          <w:szCs w:val="20"/>
+        </w:rPr>
+        <w:t>SCALE_CONFIG.stepId</w:t>
+      </w:r>
+      <w:r>
+        <w:rPr>
+          <w:rFonts w:ascii="Arial" w:hAnsi="Arial" w:eastAsia="Arial" w:cs="Arial"/>
+          <w:b w:val="0"/>
+          <w:color w:val="1A1A1A"/>
+          <w:sz w:val="21"/>
+          <w:szCs w:val="21"/>
+        </w:rPr>
+        <w:t xml:space="preserve"> (if configured)</w:t>
+      </w:r>
+    </w:p>
+    <w:p>
+      <w:pPr>
+        <w:pStyle w:val="16"/>
+        <w:numPr>
+          <w:ilvl w:val="0"/>
+          <w:numId w:val="2"/>
+        </w:numPr>
+        <w:spacing w:before="40" w:after="40"/>
+      </w:pPr>
+      <w:r>
+        <w:rPr>
+          <w:rFonts w:ascii="Courier New" w:hAnsi="Courier New" w:cs="Courier New"/>
+          <w:b/>
+          <w:color w:val="1B4F72"/>
+          <w:sz w:val="20"/>
+          <w:szCs w:val="20"/>
+        </w:rPr>
+        <w:t>trusted_form_url</w:t>
+      </w:r>
+      <w:r>
+        <w:rPr>
+          <w:rFonts w:ascii="Arial" w:hAnsi="Arial" w:eastAsia="Arial" w:cs="Arial"/>
+          <w:b w:val="0"/>
+          <w:color w:val="1A1A1A"/>
+          <w:sz w:val="21"/>
+          <w:szCs w:val="21"/>
+        </w:rPr>
+        <w:t xml:space="preserve"> — TrustedForm certificate URL (if </w:t>
+      </w:r>
+      <w:r>
+        <w:rPr>
+          <w:rFonts w:ascii="Courier New" w:hAnsi="Courier New" w:cs="Courier New"/>
+          <w:b w:val="0"/>
+          <w:color w:val="1B4F72"/>
+          <w:sz w:val="20"/>
+          <w:szCs w:val="20"/>
+        </w:rPr>
+        <w:t>features.trustedForm</w:t>
+      </w:r>
+      <w:r>
+        <w:rPr>
+          <w:rFonts w:ascii="Arial" w:hAnsi="Arial" w:eastAsia="Arial" w:cs="Arial"/>
+          <w:b w:val="0"/>
+          <w:color w:val="1A1A1A"/>
+          <w:sz w:val="21"/>
+          <w:szCs w:val="21"/>
+        </w:rPr>
+        <w:t xml:space="preserve"> is enabled)</w:t>
+      </w:r>
+    </w:p>
+    <w:p>
+      <w:pPr>
+        <w:spacing w:before="100" w:after="0"/>
+      </w:pPr>
+    </w:p>
+    <w:p>
+      <w:pPr>
+        <w:pStyle w:val="4"/>
+        <w:spacing w:before="180" w:after="70"/>
+      </w:pPr>
+      <w:r>
+        <w:rPr>
+          <w:rFonts w:ascii="Arial" w:hAnsi="Arial" w:eastAsia="Arial" w:cs="Arial"/>
+          <w:b/>
+          <w:bCs/>
+          <w:color w:val="2C3E50"/>
+          <w:sz w:val="23"/>
+          <w:szCs w:val="23"/>
+        </w:rPr>
+        <w:t>POST /api/contacts/public — automatic enrichment</w:t>
+      </w:r>
+    </w:p>
+    <w:p>
+      <w:pPr>
+        <w:spacing w:before="80" w:after="80"/>
+        <w:jc w:val="left"/>
+      </w:pPr>
+      <w:r>
+        <w:rPr>
+          <w:rFonts w:ascii="Arial" w:hAnsi="Arial" w:eastAsia="Arial" w:cs="Arial"/>
+          <w:b w:val="0"/>
+          <w:bCs w:val="0"/>
+          <w:color w:val="1A1A1A"/>
+          <w:sz w:val="22"/>
+          <w:szCs w:val="22"/>
+        </w:rPr>
+        <w:t xml:space="preserve">If </w:t>
+      </w:r>
+      <w:r>
+        <w:rPr>
+          <w:rFonts w:ascii="Courier New" w:hAnsi="Courier New" w:cs="Courier New"/>
+          <w:b w:val="0"/>
+          <w:color w:val="1B4F72"/>
+          <w:sz w:val="20"/>
+          <w:szCs w:val="20"/>
+        </w:rPr>
+        <w:t>SCALE_CONFIG.recaptchaKey</w:t>
+      </w:r>
+      <w:r>
+        <w:rPr>
+          <w:rFonts w:ascii="Arial" w:hAnsi="Arial" w:eastAsia="Arial" w:cs="Arial"/>
+          <w:b w:val="0"/>
+          <w:bCs w:val="0"/>
+          <w:color w:val="1A1A1A"/>
+          <w:sz w:val="22"/>
+          <w:szCs w:val="22"/>
+        </w:rPr>
+        <w:t xml:space="preserve"> is configured, the SDK automatically executes reCAPTCHA v3 and injects the resulting </w:t>
+      </w:r>
+      <w:r>
+        <w:rPr>
+          <w:rFonts w:ascii="Courier New" w:hAnsi="Courier New" w:cs="Courier New"/>
+          <w:b w:val="0"/>
+          <w:color w:val="1B4F72"/>
+          <w:sz w:val="20"/>
+          <w:szCs w:val="20"/>
+        </w:rPr>
+        <w:t>recaptcha_token</w:t>
+      </w:r>
+      <w:r>
+        <w:rPr>
+          <w:rFonts w:ascii="Arial" w:hAnsi="Arial" w:eastAsia="Arial" w:cs="Arial"/>
+          <w:b w:val="0"/>
+          <w:bCs w:val="0"/>
+          <w:color w:val="1A1A1A"/>
+          <w:sz w:val="22"/>
+          <w:szCs w:val="22"/>
+        </w:rPr>
+        <w:t xml:space="preserve"> into every </w:t>
+      </w:r>
+      <w:r>
+        <w:rPr>
+          <w:rFonts w:ascii="Courier New" w:hAnsi="Courier New" w:cs="Courier New"/>
+          <w:b w:val="0"/>
+          <w:color w:val="1B4F72"/>
+          <w:sz w:val="20"/>
+          <w:szCs w:val="20"/>
+        </w:rPr>
+        <w:t>POST /api/contacts/public</w:t>
+      </w:r>
+      <w:r>
+        <w:rPr>
+          <w:rFonts w:ascii="Arial" w:hAnsi="Arial" w:eastAsia="Arial" w:cs="Arial"/>
+          <w:b w:val="0"/>
+          <w:bCs w:val="0"/>
+          <w:color w:val="1A1A1A"/>
+          <w:sz w:val="22"/>
+          <w:szCs w:val="22"/>
+        </w:rPr>
+        <w:t xml:space="preserve"> request. No changes needed in your contact form code.</w:t>
+      </w:r>
+    </w:p>
+    <w:p>
+      <w:pPr>
+        <w:spacing w:before="160" w:after="0"/>
+      </w:pPr>
+    </w:p>
+    <w:p>
+      <w:pPr>
+        <w:pStyle w:val="3"/>
+        <w:spacing w:before="240" w:after="100"/>
+      </w:pPr>
+      <w:r>
+        <w:rPr>
+          <w:rFonts w:ascii="Arial" w:hAnsi="Arial" w:eastAsia="Arial" w:cs="Arial"/>
+          <w:b/>
+          <w:bCs/>
+          <w:color w:val="2E86C1"/>
+          <w:sz w:val="27"/>
+          <w:szCs w:val="27"/>
+        </w:rPr>
+        <w:t>3.4 Analytics — GTM (scale-analytics.js)</w:t>
       </w:r>
     </w:p>
     <w:p>
@@ -19622,7 +20002,7 @@
                 <w:sz w:val="19"/>
                 <w:szCs w:val="19"/>
               </w:rPr>
-              <w:t>Get a dynamic number (DNI) for a session.</w:t>
+              <w:t>Fallback endpoint: get a dynamic number (DNI) for a session. Called only if /api/visits did not return a phone in its response.</w:t>
             </w:r>
           </w:p>
         </w:tc>
@@ -21919,7 +22299,7 @@
           <w:sz w:val="18"/>
           <w:szCs w:val="18"/>
         </w:rPr>
-        <w:t>Scale Platform — Internal Documentation. Version 1.0 — 2025.</w:t>
+        <w:t>Scale Platform — Internal Documentation. Version 1.1 — 2026.</w:t>
       </w:r>
     </w:p>
     <w:sectPr>

</xml_diff>